<commit_message>
Update Chapter II with tool-focused theoretical content
</commit_message>
<xml_diff>
--- a/Bao_cao_TN.docx
+++ b/Bao_cao_TN.docx
@@ -2075,6 +2075,114 @@
           <w:szCs w:val="26"/>
         </w:rPr>
         <w:t>II. CƠ SỞ LÝ THUYẾT</w:t>
+      </w:r>
+    </w:p>
+    <w:p>
+      <w:pPr/>
+      <w:r>
+        <w:t>2.1. Cơ sở lý thuyết về Optical Music Recognition (OMR)</w:t>
+      </w:r>
+    </w:p>
+    <w:p>
+      <w:pPr/>
+      <w:r>
+        <w:t>OMR là lĩnh vực nghiên cứu chuyển đổi bản nhạc dạng hình ảnh sang biểu diễn số có cấu trúc. Về bản chất, OMR kết hợp thị giác máy tính và tri thức âm nhạc để nhận diện ký hiệu, sau đó ánh xạ chúng thành đơn vị thông tin có nghĩa. Trọng tâm lý thuyết của OMR là xử lý đồng thời tính chính xác hình học và tính đúng ngữ nghĩa âm nhạc.</w:t>
+      </w:r>
+    </w:p>
+    <w:p>
+      <w:pPr/>
+      <w:r>
+        <w:t>2.2. Cơ sở lý thuyết xử lý ảnh số</w:t>
+      </w:r>
+    </w:p>
+    <w:p>
+      <w:pPr/>
+      <w:r>
+        <w:t>Ảnh số được biểu diễn bởi ma trận điểm ảnh và thường chịu tác động của nhiễu, lệch sáng, méo hình và sai khác độ phân giải. Các nguyên lý tiền xử lý tập trung vào chuẩn hóa dữ liệu đầu vào để tăng độ ổn định của bước nhận dạng phía sau. Nhóm kỹ thuật cốt lõi gồm lọc nhiễu, chuẩn hóa tương phản, hiệu chỉnh hình học và các phép toán hình thái học.</w:t>
+      </w:r>
+    </w:p>
+    <w:p>
+      <w:pPr/>
+      <w:r>
+        <w:t>2.3. Cơ sở lý thuyết Deep Learning cho nhận dạng ký hiệu</w:t>
+      </w:r>
+    </w:p>
+    <w:p>
+      <w:pPr/>
+      <w:r>
+        <w:t>Deep Learning cho phép mô hình học trực tiếp đặc trưng từ dữ liệu thay vì phụ thuộc hoàn toàn vào đặc trưng thủ công. Trong bài toán nhận dạng ký hiệu, mạng nơ-ron tích chập (CNN) có khả năng trích xuất đặc trưng không gian nhiều mức. Cơ chế học phân cấp giúp mô hình nhận biết cả cấu trúc tổng thể và chi tiết nhỏ của ký hiệu âm nhạc.</w:t>
+      </w:r>
+    </w:p>
+    <w:p>
+      <w:pPr/>
+      <w:r>
+        <w:t>2.4. Lý thuyết mô hình U-Net và phân đoạn ngữ nghĩa</w:t>
+      </w:r>
+    </w:p>
+    <w:p>
+      <w:pPr/>
+      <w:r>
+        <w:t>U-Net là kiến trúc encoder-decoder có các kết nối tắt (skip connections), giúp giữ thông tin biên và chi tiết cục bộ khi tái tạo bản đồ phân đoạn. Về lý thuyết, phân đoạn ngữ nghĩa gán nhãn lớp cho từng điểm ảnh, phù hợp với bài toán có nhiều ký hiệu xen kẽ như bản nhạc. Ưu điểm chính là độ chính xác biên đối tượng cao; hạn chế là phụ thuộc chất lượng dữ liệu gán nhãn và chi phí tính toán.</w:t>
+      </w:r>
+    </w:p>
+    <w:p>
+      <w:pPr/>
+      <w:r>
+        <w:t>2.5. Cơ sở lý thuyết ONNX và ONNX Runtime</w:t>
+      </w:r>
+    </w:p>
+    <w:p>
+      <w:pPr/>
+      <w:r>
+        <w:t>ONNX là chuẩn mở dùng để biểu diễn mô hình học máy theo định dạng trung gian, tạo khả năng tương thích giữa nhiều framework. ONNX Runtime là môi trường suy luận tối ưu, hỗ trợ nhiều backend phần cứng và cơ chế tăng tốc thực thi. Ý nghĩa lý thuyết của bộ công cụ này là tách biệt giai đoạn huấn luyện khỏi giai đoạn triển khai suy luận.</w:t>
+      </w:r>
+    </w:p>
+    <w:p>
+      <w:pPr/>
+      <w:r>
+        <w:t>2.6. Cơ sở lý thuyết MusicXML</w:t>
+      </w:r>
+    </w:p>
+    <w:p>
+      <w:pPr/>
+      <w:r>
+        <w:t>MusicXML là chuẩn biểu diễn ký âm số theo cấu trúc phân cấp, cho phép mô tả đầy đủ thành phần âm nhạc ở mức bản nhạc và nốt. Chuẩn này hỗ trợ trao đổi dữ liệu giữa các phần mềm biên soạn, phát nhạc và phân tích âm nhạc. Các thực thể khái niệm quan trọng gồm part, measure, note, pitch và duration.</w:t>
+      </w:r>
+    </w:p>
+    <w:p>
+      <w:pPr/>
+      <w:r>
+        <w:t>2.7. Cơ sở lý thuyết các thư viện nền tảng</w:t>
+      </w:r>
+    </w:p>
+    <w:p>
+      <w:pPr/>
+      <w:r>
+        <w:t>OpenCV cung cấp nền tảng xử lý ảnh và thị giác máy tính theo hướng tối ưu thực dụng; NumPy hỗ trợ biểu diễn và tính toán ma trận hiệu năng cao; TensorFlow/ONNX phục vụ xây dựng và suy luận mô hình học sâu. Ở góc độ lý thuyết công cụ, các thư viện này tạo thành hệ sinh thái thống nhất giữa xử lý dữ liệu, học mô hình và thực thi suy luận.</w:t>
+      </w:r>
+    </w:p>
+    <w:p>
+      <w:pPr/>
+      <w:r>
+        <w:t>2.8. Cơ sở lý thuyết về chỉ số đánh giá</w:t>
+      </w:r>
+    </w:p>
+    <w:p>
+      <w:pPr/>
+      <w:r>
+        <w:t>Các chỉ số đánh giá dùng để định lượng mức độ đúng của mô hình trên dữ liệu kiểm thử. Accuracy phản ánh tỷ lệ dự đoán đúng tổng quát, trong khi edit distance đo mức sai lệch chuỗi giữa kết quả dự đoán và dữ liệu tham chiếu. Về mặt thống kê, việc kết hợp nhiều chỉ số giúp đánh giá cân bằng hơn giữa độ chính xác ký hiệu và tính nhất quán cấu trúc.</w:t>
+      </w:r>
+    </w:p>
+    <w:p>
+      <w:pPr/>
+      <w:r>
+        <w:t>Tiểu kết chương II</w:t>
+      </w:r>
+    </w:p>
+    <w:p>
+      <w:pPr/>
+      <w:r>
+        <w:t>Chương này trình bày nền tảng lý thuyết của các công cụ và chuẩn dữ liệu được sử dụng trong đề tài. Phần nội dung tập trung vào bản chất, nguyên lý và vai trò học thuật của từng công cụ, không đi vào mô tả quy trình triển khai hệ thống.</w:t>
       </w:r>
     </w:p>
     <w:p>

</xml_diff>